<commit_message>
paper: derive the opening-error bound in an appendix
Section 6.7 quotes a post hoc lower bound on the open's error that does
not assume the error is independent of news; its derivation lived only
in a script docstring. Appendix A now states the assumptions (those of
the unbiasedness regression, in raw second moments) and the two-case
Cauchy-Schwarz argument, so a referee can check it on the page.
</commit_message>
<xml_diff>
--- a/paper/NEPSE_Volatility_Manuscript_Revised_2026-09.docx
+++ b/paper/NEPSE_Volatility_Manuscript_Revised_2026-09.docx
@@ -3182,7 +3182,7 @@
     <w:p>
       <w:pPr/>
       <w:r>
-        <w:t>Three consequences follow for measurement. First, the exact identity YZ - Var(r) = (1 - k)[mean RS - Var(c)] - 2Cov(o, c) shows what Yang and Zhang's independence assumption costs. Over all 135,899 21-session windows, Yang-Zhang is 1.637 [1.481, 1.847] times the matched close-to-close variance, the 1.280 of Section 6.5 on the standard-deviation scale, and 75.6% [66.2%, 86.9%] of the excess is the overnight-intraday covariance. The ratio rises from 1.551 to 2.682 across the reform (frozen verdict: confirmed), while on NIFTY 50 Yang-Zhang matches close-to-close (0.960 [0.922, 1.006]). Second, Parkinson inherits the open's error whenever the open is the session's high or low, which a non-stale NEPSE open is on 36% of sessions in the first regime and 51% after the reform (post hoc). Third, a ratio to the open-to-close proxy cannot see this. Across the reform Parkinson's ratio to the proxy moves from 0.977 to 0.880, a change of -0.097 [-0.224, 0.024] whose interval contains zero, while its ratio to the noise-robust kernel K = c² + oc + co′, the daily analogue of Zhou's (1996) first-order correction, rises from 1.191 to 2.009, a change of 0.818 [0.362, 1.413] (Table 32). The frozen rule therefore returns 'no inversion established', but the asymmetry is the point. The kernel is unbiased only if the opening error is independent of overnight news, so its shares are estimates under that assumption. A post hoc bound that assumes nothing about that correlation still puts the open's error at no less than 5.0% of the open-to-close proxy in the first regime and 17.2% [13.9%, 19.8%] after the reform, against 48.0% if it is independent of news.</w:t>
+        <w:t>Three consequences follow for measurement. First, the exact identity YZ - Var(r) = (1 - k)[mean RS - Var(c)] - 2Cov(o, c) shows what Yang and Zhang's independence assumption costs. Over all 135,899 21-session windows, Yang-Zhang is 1.637 [1.481, 1.847] times the matched close-to-close variance, the 1.280 of Section 6.5 on the standard-deviation scale, and 75.6% [66.2%, 86.9%] of the excess is the overnight-intraday covariance. The ratio rises from 1.551 to 2.682 across the reform (frozen verdict: confirmed), while on NIFTY 50 Yang-Zhang matches close-to-close (0.960 [0.922, 1.006]). Second, Parkinson inherits the open's error whenever the open is the session's high or low, which a non-stale NEPSE open is on 36% of sessions in the first regime and 51% after the reform (post hoc). Third, a ratio to the open-to-close proxy cannot see this. Across the reform Parkinson's ratio to the proxy moves from 0.977 to 0.880, a change of -0.097 [-0.224, 0.024] whose interval contains zero, while its ratio to the noise-robust kernel K = c² + oc + co′, the daily analogue of Zhou's (1996) first-order correction, rises from 1.191 to 2.009, a change of 0.818 [0.362, 1.413] (Table 32). The frozen rule therefore returns 'no inversion established', but the asymmetry is the point. The kernel is unbiased only if the opening error is independent of overnight news, so its shares are estimates under that assumption. A post hoc bound that assumes nothing about that correlation (Appendix A) still puts the open's error at no less than 5.0% of the open-to-close proxy in the first regime and 17.2% [13.9%, 19.8%] after the reform, against 48.0% if it is independent of news.</w:t>
       </w:r>
     </w:p>
     <w:p>
@@ -17819,6 +17819,31 @@
         <w:rPr>
           <w:b w:val="0"/>
         </w:rPr>
+      </w:r>
+    </w:p>
+    <w:p>
+      <w:pPr>
+        <w:pStyle w:val="Heading1"/>
+        <w:spacing w:before="120" w:after="120"/>
+        <w:jc w:val="left"/>
+      </w:pPr>
+      <w:r>
+        <w:rPr>
+          <w:b/>
+        </w:rPr>
+        <w:t>Appendix A. A bound on the opening error that does not assume independence from news</w:t>
+      </w:r>
+    </w:p>
+    <w:p>
+      <w:pPr>
+        <w:spacing w:before="120" w:after="120"/>
+        <w:jc w:val="left"/>
+      </w:pPr>
+      <w:r>
+        <w:rPr>
+          <w:b/>
+        </w:rPr>
+        <w:t>Write the overnight and intraday returns as o = e_o + η - ε_prev and c = e_c - η + ε, where e_o and e_c are efficient returns, η is the open's transient error and ε the close's. Assume only what the unbiasedness regression needs: e_o and e_c are uncorrelated, and η and ε are uncorrelated with e_c, with each other and with earlier closing errors. η may be correlated with e_o in either direction. Then -E[o c] = E[e_o η] + E[η²], and E[o²] = E[e_o²] + 2E[e_o η] + E[η²] + E[ε²], all raw second moments, as in b. If E[e_o η] ≥ 0, then E[e_o²] ≤ E[o²] and, by Cauchy-Schwarz, -E[o c] ≤ (E[o²]E[η²])^½ + E[η²]; solving for E[η²] with -E[o c] = (1 - b)E[o²] gives E[η²] ≥ E[o²]·((√(5 - 4b) - 1)/2)². If E[e_o η] &lt; 0, then E[η²] &gt; -E[o c] = (1 - b)E[o²], which exceeds the same bound because ((√(1 + 4x) - 1)/2)² ≤ x for x ≥ 0. The bound therefore holds whatever the sign or size of the error's correlation with news. It is attained when η is perfectly correlated with e_o; under independence E[η²] = (1 - b)E[o²]. Both are reported as shares of the open-to-close proxy, E[c²], in Table 32 and in table97_m15_posthoc.csv, where the bound was computed after the frozen results were seen.</w:t>
       </w:r>
     </w:p>
     <w:sectPr>

</xml_diff>

<commit_message>
paper: make close-to-close the primary NEPSE specification in 7.1
Section 7.1 still recommended rolling Parkinson or Rogers-Satchell as
the primary 21-session specification for NEPSE, which Section 6.7 now
contradicts: both read an opening price the session mostly reverses.
In NEPSE the primary is now close-to-close, which never reads the open,
with a range estimator beside it as a cross-check and the open's
unbiasedness coefficient reported; where the open is close to
unbiased, the range estimators remain the natural primary.

Also records round 14 in the manifest builder and updates the post hoc
labels in the README and reproducibility map to X1-X6.
</commit_message>
<xml_diff>
--- a/paper/NEPSE_Volatility_Manuscript_Revised_2026-09.docx
+++ b/paper/NEPSE_Volatility_Manuscript_Revised_2026-09.docx
@@ -16938,7 +16938,7 @@
     </w:p>
     <w:p>
       <w:r>
-        <w:t>For a 21-session risk measure, a transparent primary specification for an ordinary NEPSE equity is the annualized rolling Parkinson or Rogers-Satchell volatility:</w:t>
+        <w:t>For a 21-session risk measure the annualized rolling form below applies to any daily variance estimator. In NEPSE, where the opening price is mostly transient (Section 6.7), the primary specification should be close-to-close variance, which never reads the open, with Parkinson or Rogers-Satchell reported beside it as a cross-check; where the open is close to unbiased, the range estimators' efficiency makes them the natural primary:</w:t>
       </w:r>
     </w:p>
     <w:p>
@@ -16956,7 +16956,7 @@
     </w:p>
     <w:p>
       <w:r>
-        <w:t>where v̂ is the chosen daily variance estimator and A is the market's own annual session count rather than an imported convention. For NEPSE over the study window the detected trading calendar yields A ≈ 229.6 genuine sessions per year (569 sessions over 2.48 years), against the 252 a developed-market default would impose; annualising with 252 instead would inflate variance by 9.7% and volatility by 4.8%. This is a SAMPLE-PERIOD OBSERVED RATE, not a NEPSE convention, and it spans the April 2026 trading-week reform. We do not quote a regime-specific factor. The post-reform Monday-Friday window contains only 99 sessions over 0.39 of a year, so annualising it (255/year, against 225/year pre-reform) extrapolates from a partial year; and because both regimes schedule five sessions per week, the reform cannot by itself change the annual session count — the difference reflects the holiday composition of that short window rather than the trading week. A usable regime-specific factor requires a complete observed year or an official weekday-plus-holiday projection. The report should show close-to-close volatility beside the range measure and disclose the security's median trade count and zero-range rate, so a reader can see the conditions under which the number was produced.</w:t>
+        <w:t>where v̂ is the chosen daily variance estimator and A is the market's own annual session count rather than an imported convention. For NEPSE over the study window the detected trading calendar yields A ≈ 229.6 genuine sessions per year (569 sessions over 2.48 years), against the 252 a developed-market default would impose; annualising with 252 instead would inflate variance by 9.7% and volatility by 4.8%. This is a SAMPLE-PERIOD OBSERVED RATE, not a NEPSE convention, and it spans the April 2026 trading-week reform. We do not quote a regime-specific factor. The post-reform Monday-Friday window contains only 99 sessions over 0.39 of a year, so annualising it (255/year, against 225/year pre-reform) extrapolates from a partial year; and because both regimes schedule five sessions per week, the reform cannot by itself change the annual session count — the difference reflects the holiday composition of that short window rather than the trading week. A usable regime-specific factor requires a complete observed year or an official weekday-plus-holiday projection. The report should show close-to-close volatility beside the range measure, disclose the security's median trade count and zero-range rate, and report the unbiasedness coefficient of the open, so a reader can see the conditions under which the number was produced.</w:t>
       </w:r>
     </w:p>
     <w:p>

</xml_diff>